<commit_message>
Cite the sampling authority and the UKNI nuance in the speaker notes
Two refinements a regulatory audience is likely to probe:

- Slide 16 now names the authority for the Class IIa/IIb sampling
  difference -- Article 52(6) sets the IIa basis at one representative
  device per category, Article 52(4) sets the IIb basis at one per
  generic device group -- and points at MDCG 2019-13, which is the
  guidance on what a generic device group means in practice. Added to
  the workbook's source list too.
- Slide 30 now carries the UKNI indication nuance: where a UK-based
  body performs the conformity assessment for the Northern Ireland
  market, the device carries CE marking with the UKNI indication. It
  does not change the slide's substance, but someone may raise it.

Co-Authored-By: Claude Opus 5 <noreply@anthropic.com>
Claude-Session: https://claude.ai/code/session_01FPYtZB6P1JoD1JsvRRZGPF
</commit_message>
<xml_diff>
--- a/seminars/global-market-entry/Participant_Workbook.docx
+++ b/seminars/global-market-entry/Participant_Workbook.docx
@@ -13432,7 +13432,7 @@
                 <w:color w:val="22333B"/>
                 <w:sz w:val="18"/>
               </w:rPr>
-              <w:t>MDCG guidance, especially 2020-5 and 2020-6</w:t>
+              <w:t>MDCG guidance — 2020-5, 2020-6 and 2019-13</w:t>
             </w:r>
           </w:p>
         </w:tc>
@@ -13453,7 +13453,7 @@
                 <w:color w:val="22333B"/>
                 <w:sz w:val="18"/>
               </w:rPr>
-              <w:t>How equivalence is assessed, and what legacy clinical data can support.</w:t>
+              <w:t>How equivalence is assessed, what legacy clinical data can support, and how notified bodies sample technical documentation for Class IIa and IIb.</w:t>
             </w:r>
           </w:p>
         </w:tc>

</xml_diff>